<commit_message>
Name the two grids specification curves rather than questions
The label was doing the wrong work. Simonsohn's criterion is that the
specifications inside one curve must test the same question, so calling level
and change "two questions" was accurate about why they are separated but put an
informal word where the technical one belongs.

They are now Specification curve A (level) and Specification curve B (change).
The word question survives only where it carries the argument: the two curves
are separated because they answer different questions, which is the
justification, not the name.

Co-Authored-By: Claude Opus 5 <noreply@anthropic.com>
</commit_message>
<xml_diff>
--- a/CONTESTED.docx
+++ b/CONTESTED.docx
@@ -344,7 +344,7 @@
                 <w:color w:val="101010"/>
                 <w:sz w:val="17"/>
               </w:rPr>
-              <w:t>Two questions, scored separately.</w:t>
+              <w:t>Two specification curves, scored separately.</w:t>
             </w:r>
             <w:r>
               <w:rPr>
@@ -654,7 +654,7 @@
           <w:color w:val="101010"/>
           <w:sz w:val="19"/>
         </w:rPr>
-        <w:t>3. Two questions, not one distribution.</w:t>
+        <w:t>3. Two specification curves, not one distribution.</w:t>
       </w:r>
       <w:r>
         <w:rPr>
@@ -730,7 +730,7 @@
           <w:color w:val="101010"/>
           <w:sz w:val="19"/>
         </w:rPr>
-        <w:t xml:space="preserve"> Within Question A, with the peer set fixed to BECS groups, the median company still moves </w:t>
+        <w:t xml:space="preserve"> Within Curve A, with the peer set fixed to BECS groups, the median company still moves </w:t>
       </w:r>
       <w:r>
         <w:rPr>
@@ -750,7 +750,7 @@
           <w:color w:val="101010"/>
           <w:sz w:val="19"/>
         </w:rPr>
-        <w:t>; against the whole sector, 5.0. Weights add 3.0 more. Pooled across both questions it would read 7.0, which is why we do not pool.</w:t>
+        <w:t>; against the whole sector, 5.0. Weights add 3.0 more. Pooled across both curves it would read 7.0, which is why we do not pool.</w:t>
       </w:r>
     </w:p>
     <w:p>
@@ -882,7 +882,7 @@
           <w:color w:val="101010"/>
           <w:sz w:val="19"/>
         </w:rPr>
-        <w:t xml:space="preserve"> The two questions are the two halves of a transition portfolio: Question A prices today's leaders, Question B identifies tomorrow's. §8 allocates $1bn on the gap between them.</w:t>
+        <w:t xml:space="preserve"> The two curves are the two halves of a transition portfolio: Curve A prices today's leaders, Curve B identifies tomorrow's. §8 allocates $1bn on the gap between them.</w:t>
       </w:r>
     </w:p>
     <w:p>
@@ -906,7 +906,7 @@
           <w:color w:val="101010"/>
           <w:sz w:val="19"/>
         </w:rPr>
-        <w:t xml:space="preserve">   The two questions give different answers, which is why they are scored separately</w:t>
+        <w:t xml:space="preserve">   The two curves give different answers, which is why they are scored separately</w:t>
       </w:r>
     </w:p>
     <w:p>
@@ -962,7 +962,7 @@
           <w:color w:val="6B6A63"/>
           <w:sz w:val="15"/>
         </w:rPr>
-        <w:t>Interquartile box per company under each question, sorted by Question A median. Blue = level, orange = change. EOG sits at 94 on level and 35 on change; MPC at 18 and 71. Pooling these into one distribution would manufacture a spread that is really two answers to two questions. Source: model/out/long.csv.</w:t>
+        <w:t>Interquartile box per company under each specification curve, sorted by Curve A median. Blue = level, orange = change. EOG sits at 94 on level and 35 on change; MPC at 18 and 71. Pooling these into one distribution would manufacture a spread that is really two answers to two different questions. Source: model/out/long.csv.</w:t>
       </w:r>
     </w:p>
     <w:p>
@@ -7757,7 +7757,7 @@
           <w:color w:val="C04A12"/>
           <w:sz w:val="21"/>
         </w:rPr>
-        <w:t>4.2 Two questions, two grids, the central revision</w:t>
+        <w:t>4.2 Two specification curves, not one grid, the central revision</w:t>
       </w:r>
     </w:p>
     <w:p>
@@ -7869,7 +7869,7 @@
                 <w:color w:val="3D3C38"/>
                 <w:sz w:val="15"/>
               </w:rPr>
-              <w:t xml:space="preserve">Question A, </w:t>
+              <w:t xml:space="preserve">Specification curve A, </w:t>
             </w:r>
             <w:r>
               <w:rPr>
@@ -7906,7 +7906,7 @@
                 <w:color w:val="3D3C38"/>
                 <w:sz w:val="15"/>
               </w:rPr>
-              <w:t xml:space="preserve">Question B, </w:t>
+              <w:t xml:space="preserve">Specification curve B, </w:t>
             </w:r>
             <w:r>
               <w:rPr>
@@ -8360,7 +8360,7 @@
           <w:color w:val="101010"/>
           <w:sz w:val="19"/>
         </w:rPr>
-        <w:t>Within each question the remaining seven axes are genuine competing methods for the same question, which is the grid specification-curve analysis licenses.</w:t>
+        <w:t>Within each curve the remaining seven axes are genuine competing specifications for the same question, which is the grid specification curve analysis licenses.</w:t>
       </w:r>
     </w:p>
     <w:p>
@@ -8483,7 +8483,7 @@
           <w:color w:val="101010"/>
           <w:sz w:val="19"/>
         </w:rPr>
-        <w:t xml:space="preserve">   Median contestation, Question A, by how much is held fixed</w:t>
+        <w:t xml:space="preserve">   Median contestation, Curve A, by how much is held fixed</w:t>
       </w:r>
     </w:p>
     <w:tbl>
@@ -8603,7 +8603,7 @@
                 <w:color w:val="101010"/>
                 <w:sz w:val="16"/>
               </w:rPr>
-              <w:t>Both questions pooled (we do not report this)</w:t>
+              <w:t>Both curves pooled (we do not report this)</w:t>
             </w:r>
           </w:p>
         </w:tc>
@@ -8680,7 +8680,7 @@
                 <w:color w:val="101010"/>
                 <w:sz w:val="16"/>
               </w:rPr>
-              <w:t>Question A only (level)</w:t>
+              <w:t>Curve A only (level)</w:t>
             </w:r>
           </w:p>
         </w:tc>
@@ -8757,7 +8757,7 @@
                 <w:color w:val="101010"/>
                 <w:sz w:val="16"/>
               </w:rPr>
-              <w:t>Question A × sector peers</w:t>
+              <w:t>Curve A × sector peers</w:t>
             </w:r>
           </w:p>
         </w:tc>
@@ -8834,7 +8834,7 @@
                 <w:color w:val="101010"/>
                 <w:sz w:val="16"/>
               </w:rPr>
-              <w:t>Question A × BECS peer groups</w:t>
+              <w:t>Curve A × BECS peer groups</w:t>
             </w:r>
           </w:p>
         </w:tc>
@@ -8911,7 +8911,7 @@
                 <w:color w:val="101010"/>
                 <w:sz w:val="16"/>
               </w:rPr>
-              <w:t>Question A × strict evidence bar</w:t>
+              <w:t>Curve A × strict evidence bar</w:t>
             </w:r>
           </w:p>
         </w:tc>
@@ -9047,7 +9047,7 @@
           <w:color w:val="6B6A63"/>
           <w:sz w:val="15"/>
         </w:rPr>
-        <w:t>The random-rank control is the test that matters: a randomly ordered company would show 8.5 to 9.0 places. Pooled, the figure would be 7.0, barely below noise, which is why we do not pool. Question A at 3.0 is well inside it.</w:t>
+        <w:t>The random-rank control is the test that matters: a randomly ordered company would show 8.5 to 9.0 places. Pooled, the figure would be 7.0, barely below noise, which is why we do not pool. Curve A at 3.0 is well inside it.</w:t>
       </w:r>
     </w:p>
     <w:tbl>
@@ -9091,7 +9091,7 @@
                 <w:color w:val="101010"/>
                 <w:sz w:val="20"/>
               </w:rPr>
-              <w:t xml:space="preserve"> Pooling two questions would report 7.0; a third of that pooled. What remains is a third of the ranking still being a methodological choice, smaller than we claimed, and still larger than any published score admits.</w:t>
+              <w:t xml:space="preserve"> Pooling the two curves would report 7.0; a third of that pooled. What remains is a third of the ranking still being a methodological choice, smaller than we claimed, and still larger than any published score admits.</w:t>
             </w:r>
           </w:p>
         </w:tc>
@@ -9123,7 +9123,7 @@
           <w:color w:val="101010"/>
           <w:sz w:val="19"/>
         </w:rPr>
-        <w:t xml:space="preserve">   Specification curve and absolute intensity, Question A, sector peers</w:t>
+        <w:t xml:space="preserve">   Specification curve and absolute intensity, Curve A, sector peers</w:t>
       </w:r>
     </w:p>
     <w:p>
@@ -9179,7 +9179,7 @@
           <w:color w:val="6B6A63"/>
           <w:sz w:val="15"/>
         </w:rPr>
-        <w:t>Every company's 2,916 Question-A scores, sorted best to worst. Flat = robust; steep = the method decides. Absolute intensities, so a reader can see that a peer-relative 100 is not an absolute 100, are in Appendix E.</w:t>
+        <w:t>Every company's 2,916 Curve-A scores, sorted best to worst. Flat = robust; steep = the method decides. Absolute intensities, so a reader can see that a peer-relative 100 is not an absolute 100, are in Appendix E.</w:t>
       </w:r>
     </w:p>
     <w:p>
@@ -9366,7 +9366,7 @@
                 <w:color w:val="101010"/>
                 <w:sz w:val="16"/>
               </w:rPr>
-              <w:t>Both questions pooled, P &gt; 0.95</w:t>
+              <w:t>Both curves pooled, P &gt; 0.95</w:t>
             </w:r>
           </w:p>
         </w:tc>
@@ -9468,7 +9468,7 @@
                 <w:color w:val="101010"/>
                 <w:sz w:val="16"/>
               </w:rPr>
-              <w:t>Both questions pooled, P &gt; 0.99</w:t>
+              <w:t>Both curves pooled, P &gt; 0.99</w:t>
             </w:r>
           </w:p>
         </w:tc>
@@ -9570,7 +9570,7 @@
                 <w:color w:val="101010"/>
                 <w:sz w:val="16"/>
               </w:rPr>
-              <w:t>Question A only, P &gt; 0.95</w:t>
+              <w:t>Curve A only, P &gt; 0.95</w:t>
             </w:r>
           </w:p>
         </w:tc>
@@ -9672,7 +9672,7 @@
                 <w:color w:val="101010"/>
                 <w:sz w:val="16"/>
               </w:rPr>
-              <w:t>Question A × strict evidence bar, P &gt; 0.95</w:t>
+              <w:t>Curve A × strict evidence bar, P &gt; 0.95</w:t>
             </w:r>
           </w:p>
         </w:tc>
@@ -10178,7 +10178,7 @@
           <w:color w:val="101010"/>
           <w:sz w:val="19"/>
         </w:rPr>
-        <w:t xml:space="preserve">   Consensus rank across the five weight presets, Question A</w:t>
+        <w:t xml:space="preserve">   Consensus rank across the five weight presets, Curve A</w:t>
       </w:r>
     </w:p>
     <w:tbl>
@@ -11591,7 +11591,7 @@
           <w:color w:val="6B6A63"/>
           <w:sz w:val="15"/>
         </w:rPr>
-        <w:t>Weights move the median company 3.0 places and the most weight-sensitive 6.0 comparable to the 3.0 places of method contestation within Question A. Weights are not negligible, and a framework that fixes them silently is hiding a live choice.</w:t>
+        <w:t>Weights move the median company 3.0 places and the most weight-sensitive 6.0 comparable to the 3.0 places of method contestation within Curve A. Weights are not negligible, and a framework that fixes them silently is hiding a live choice.</w:t>
       </w:r>
     </w:p>
     <w:p>
@@ -13242,7 +13242,7 @@
                 <w:color w:val="101010"/>
                 <w:sz w:val="20"/>
               </w:rPr>
-              <w:t xml:space="preserve"> and among those, the ones our Question-B curve says are already moving.</w:t>
+              <w:t xml:space="preserve"> and among those, the ones our Curve-B curve says are already moving.</w:t>
             </w:r>
           </w:p>
         </w:tc>
@@ -14127,7 +14127,7 @@
                 <w:color w:val="101010"/>
                 <w:sz w:val="16"/>
               </w:rPr>
-              <w:t>P on Question B minus P on Question A</w:t>
+              <w:t>P on Curve B minus P on Curve A</w:t>
             </w:r>
           </w:p>
         </w:tc>
@@ -14225,7 +14225,7 @@
           <w:color w:val="6B6A63"/>
           <w:sz w:val="15"/>
         </w:rPr>
-        <w:t>P(eligible) under Question A (horizontal) against Question B (vertical). Above the diagonal = improving faster than its current standing implies. Orange = delta &gt; 0.15. This is the framework's answer to the bonus, not a separate opinion.</w:t>
+        <w:t>P(eligible) under Curve A (horizontal) against Curve B (vertical). Above the diagonal = improving faster than its current standing implies. Orange = delta &gt; 0.15. This is the framework's answer to the bonus, not a separate opinion.</w:t>
       </w:r>
     </w:p>
     <w:tbl>
@@ -15758,7 +15758,7 @@
                 <w:color w:val="101010"/>
                 <w:sz w:val="16"/>
               </w:rPr>
-              <w:t>Question-B re-rating as scoring regimes reweight toward progress</w:t>
+              <w:t>Curve-B re-rating as scoring regimes reweight toward progress</w:t>
             </w:r>
           </w:p>
         </w:tc>
@@ -16824,7 +16824,7 @@
                 <w:color w:val="101010"/>
                 <w:sz w:val="16"/>
               </w:rPr>
-              <w:t>Question A</w:t>
+              <w:t>Curve A</w:t>
             </w:r>
             <w:r>
               <w:rPr>
@@ -16844,7 +16844,7 @@
                 <w:color w:val="101010"/>
                 <w:sz w:val="16"/>
               </w:rPr>
-              <w:t>Question B</w:t>
+              <w:t>Curve B</w:t>
             </w:r>
             <w:r>
               <w:rPr>
@@ -17557,7 +17557,7 @@
                 <w:color w:val="101010"/>
                 <w:sz w:val="15"/>
               </w:rPr>
-              <w:t xml:space="preserve"> (Question A × BECS), 5.0 (Question A × sector). Contestation survives.</w:t>
+              <w:t xml:space="preserve"> (Curve A × BECS), 5.0 (Curve A × sector). Contestation survives.</w:t>
             </w:r>
           </w:p>
         </w:tc>
@@ -18079,7 +18079,7 @@
                 <w:color w:val="101010"/>
                 <w:sz w:val="15"/>
               </w:rPr>
-              <w:t>Under the pooled grid, no, which is why the verdict column was uninformative and is removed. Within Question A × BECS, 4 of 18 fall below 2 places.</w:t>
+              <w:t>Under the pooled grid, no, which is why the verdict column was uninformative and is removed. Within Curve A × BECS, 4 of 18 fall below 2 places.</w:t>
             </w:r>
           </w:p>
         </w:tc>
@@ -18156,7 +18156,7 @@
                 <w:color w:val="101010"/>
                 <w:sz w:val="15"/>
               </w:rPr>
-              <w:t>33 of 153, holding in more than 95% of Question-A cells.</w:t>
+              <w:t>33 of 153, holding in more than 95% of Curve-A cells.</w:t>
             </w:r>
             <w:r>
               <w:rPr>

</xml_diff>